<commit_message>
docs: fix week 1 analysis documents after review
- Fix pain point document heading structure
- Correct SLA business rule numbering
- Refine reopened ticket KPI definition
- Update backlog traceability and consistency
</commit_message>
<xml_diff>
--- a/DOCX/TaiLieuPhanTich/10_Product_Backlog_va_Acceptance_Criteria.docx
+++ b/DOCX/TaiLieuPhanTich/10_Product_Backlog_va_Acceptance_Criteria.docx
@@ -20694,6 +20694,104 @@
           </w:p>
         </w:tc>
       </w:tr>
+      <w:tr>
+        <w:tc>
+          <w:tcPr>
+            <w:tcW w:w="3397" w:type="dxa"/>
+          </w:tcPr>
+          <w:p>
+            <w:pPr>
+              <w:spacing w:line="252" w:lineRule="auto"/>
+              <w:jc w:val="both"/>
+              <w:rPr>
+                <w:rFonts w:eastAsia="Times New Roman"/>
+              </w:rPr>
+            </w:pPr>
+            <w:r>
+              <w:rPr>
+                <w:rFonts w:eastAsia="Times New Roman"/>
+              </w:rPr>
+              <w:t>Dữ liệu mô phỏng và kiểm thử các trường hợp bình thường, quá hạn và mở lại</w:t>
+            </w:r>
+          </w:p>
+        </w:tc>
+        <w:tc>
+          <w:tcPr>
+            <w:tcW w:w="1701" w:type="dxa"/>
+          </w:tcPr>
+          <w:p>
+            <w:pPr>
+              <w:spacing w:line="252" w:lineRule="auto"/>
+              <w:jc w:val="both"/>
+              <w:rPr>
+                <w:rFonts w:eastAsia="Times New Roman"/>
+              </w:rPr>
+            </w:pPr>
+            <w:r>
+              <w:rPr>
+                <w:rFonts w:eastAsia="Times New Roman"/>
+              </w:rPr>
+              <w:t>US21</w:t>
+            </w:r>
+          </w:p>
+        </w:tc>
+        <w:tc>
+          <w:tcPr>
+            <w:tcW w:w="1701" w:type="dxa"/>
+          </w:tcPr>
+          <w:p>
+            <w:pPr>
+              <w:spacing w:line="252" w:lineRule="auto"/>
+              <w:jc w:val="both"/>
+              <w:rPr>
+                <w:rFonts w:eastAsia="Times New Roman"/>
+                <w:lang w:val="vi-VN"/>
+              </w:rPr>
+            </w:pPr>
+            <w:r>
+              <w:rPr>
+                <w:rFonts w:eastAsia="Times New Roman"/>
+              </w:rPr>
+              <w:t>Yêu</w:t>
+            </w:r>
+            <w:r>
+              <w:rPr>
+                <w:rFonts w:eastAsia="Times New Roman"/>
+                <w:lang w:val="vi-VN"/>
+              </w:rPr>
+              <w:t xml:space="preserve"> cầu kiểm thử</w:t>
+            </w:r>
+          </w:p>
+        </w:tc>
+        <w:tc>
+          <w:tcPr>
+            <w:tcW w:w="2217" w:type="dxa"/>
+          </w:tcPr>
+          <w:p>
+            <w:pPr>
+              <w:spacing w:line="252" w:lineRule="auto"/>
+              <w:jc w:val="both"/>
+              <w:rPr>
+                <w:rFonts w:eastAsia="Times New Roman"/>
+                <w:lang w:val="vi-VN"/>
+              </w:rPr>
+            </w:pPr>
+            <w:r>
+              <w:rPr>
+                <w:rFonts w:eastAsia="Times New Roman"/>
+              </w:rPr>
+              <w:t>AC21</w:t>
+            </w:r>
+            <w:r>
+              <w:rPr>
+                <w:rFonts w:eastAsia="Times New Roman"/>
+                <w:lang w:val="vi-VN"/>
+              </w:rPr>
+              <w:t>.1-AC21.4</w:t>
+            </w:r>
+          </w:p>
+        </w:tc>
+      </w:tr>
     </w:tbl>
     <w:p>
       <w:pPr>
@@ -21068,6 +21166,7 @@
         <w:jc w:val="both"/>
       </w:pPr>
       <w:r>
+        <w:lastRenderedPageBreak/>
         <w:t>Thành viên khác đã kiểm tra trước khi merge.</w:t>
       </w:r>
     </w:p>
@@ -21091,7 +21190,6 @@
         <w:pStyle w:val="Heading2"/>
       </w:pPr>
       <w:r>
-        <w:lastRenderedPageBreak/>
         <w:t>10.9. Kết luận</w:t>
       </w:r>
     </w:p>

</xml_diff>